<commit_message>
Update Oradio3 modules - MPD.docx
</commit_message>
<xml_diff>
--- a/Documents/Control/Oradio3 modules - MPD.docx
+++ b/Documents/Control/Oradio3 modules - MPD.docx
@@ -1952,39 +1952,23 @@
         </w:rPr>
       </w:pPr>
       <w:bookmarkStart w:id="9" w:name="_Toc228883596"/>
-      <w:commentRangeStart w:id="10"/>
       <w:r>
         <w:rPr>
           <w:szCs w:val="36"/>
         </w:rPr>
-        <w:t xml:space="preserve">MPD </w:t>
-      </w:r>
-      <w:r>
-        <w:rPr>
-          <w:szCs w:val="36"/>
-        </w:rPr>
-        <w:t>control</w:t>
+        <w:t>MPD control</w:t>
       </w:r>
       <w:bookmarkEnd w:id="9"/>
-      <w:commentRangeEnd w:id="10"/>
-      <w:r>
-        <w:rPr>
-          <w:rStyle w:val="Verwijzingopmerking"/>
-          <w:sz w:val="36"/>
-          <w:szCs w:val="36"/>
-        </w:rPr>
-        <w:commentReference w:id="10"/>
-      </w:r>
     </w:p>
     <w:p>
       <w:pPr>
         <w:pStyle w:val="Kop3"/>
       </w:pPr>
-      <w:bookmarkStart w:id="11" w:name="_Toc228883597"/>
+      <w:bookmarkStart w:id="10" w:name="_Toc228883597"/>
       <w:r>
         <w:t>Initialize</w:t>
       </w:r>
-      <w:bookmarkEnd w:id="11"/>
+      <w:bookmarkEnd w:id="10"/>
     </w:p>
     <w:p>
       <w:pPr>
@@ -2004,20 +1988,20 @@
       <w:pPr>
         <w:pStyle w:val="Kop3"/>
       </w:pPr>
-      <w:bookmarkStart w:id="12" w:name="_Toc228883598"/>
-      <w:commentRangeStart w:id="13"/>
+      <w:bookmarkStart w:id="11" w:name="_Toc228883598"/>
+      <w:commentRangeStart w:id="12"/>
       <w:r>
         <w:t>Update database</w:t>
       </w:r>
-      <w:bookmarkEnd w:id="12"/>
-      <w:commentRangeEnd w:id="13"/>
+      <w:bookmarkEnd w:id="11"/>
+      <w:commentRangeEnd w:id="12"/>
       <w:r>
         <w:rPr>
           <w:rStyle w:val="Verwijzingopmerking"/>
           <w:sz w:val="32"/>
           <w:szCs w:val="28"/>
         </w:rPr>
-        <w:commentReference w:id="13"/>
+        <w:commentReference w:id="12"/>
       </w:r>
     </w:p>
     <w:p>
@@ -2079,25 +2063,7 @@
         <w:ind w:left="709" w:hanging="284"/>
       </w:pPr>
       <w:r>
-        <w:t>If preset</w:t>
-      </w:r>
-      <w:r>
-        <w:t>2</w:t>
-      </w:r>
-      <w:r>
-        <w:t xml:space="preserve"> playlist is a directory: update</w:t>
-      </w:r>
-      <w:r>
-        <w:t xml:space="preserve"> </w:t>
-      </w:r>
-      <w:r>
-        <w:t>database with preset</w:t>
-      </w:r>
-      <w:r>
-        <w:t>2</w:t>
-      </w:r>
-      <w:r>
-        <w:t xml:space="preserve"> playlist</w:t>
+        <w:t>If preset2 playlist is a directory: update database with preset2 playlist</w:t>
       </w:r>
     </w:p>
     <w:p>
@@ -2111,25 +2077,7 @@
         <w:ind w:left="709" w:hanging="284"/>
       </w:pPr>
       <w:r>
-        <w:t>If preset</w:t>
-      </w:r>
-      <w:r>
-        <w:t>3</w:t>
-      </w:r>
-      <w:r>
-        <w:t xml:space="preserve"> playlist is a directory: update</w:t>
-      </w:r>
-      <w:r>
-        <w:t xml:space="preserve"> </w:t>
-      </w:r>
-      <w:r>
-        <w:t>database with preset</w:t>
-      </w:r>
-      <w:r>
-        <w:t>3</w:t>
-      </w:r>
-      <w:r>
-        <w:t xml:space="preserve"> playlist</w:t>
+        <w:t>If preset3 playlist is a directory: update database with preset3 playlist</w:t>
       </w:r>
     </w:p>
     <w:p>
@@ -2146,37 +2094,34 @@
         <w:t xml:space="preserve">Update </w:t>
       </w:r>
       <w:r>
-        <w:t>database</w:t>
-      </w:r>
-      <w:r>
-        <w:t xml:space="preserve"> for </w:t>
+        <w:t xml:space="preserve">database for </w:t>
       </w:r>
       <w:r>
         <w:t xml:space="preserve">all </w:t>
       </w:r>
-      <w:commentRangeStart w:id="14"/>
+      <w:commentRangeStart w:id="13"/>
       <w:r>
         <w:t>directories</w:t>
       </w:r>
-      <w:commentRangeEnd w:id="14"/>
+      <w:commentRangeEnd w:id="13"/>
       <w:r>
         <w:rPr>
           <w:rStyle w:val="Verwijzingopmerking"/>
           <w:sz w:val="22"/>
           <w:szCs w:val="22"/>
         </w:rPr>
-        <w:commentReference w:id="14"/>
+        <w:commentReference w:id="13"/>
       </w:r>
     </w:p>
     <w:p>
       <w:pPr>
         <w:pStyle w:val="Kop3"/>
       </w:pPr>
-      <w:bookmarkStart w:id="15" w:name="_Toc228883599"/>
+      <w:bookmarkStart w:id="14" w:name="_Toc228883599"/>
       <w:r>
         <w:t>Clear</w:t>
       </w:r>
-      <w:bookmarkEnd w:id="15"/>
+      <w:bookmarkEnd w:id="14"/>
     </w:p>
     <w:p>
       <w:pPr>
@@ -2196,11 +2141,11 @@
       <w:pPr>
         <w:pStyle w:val="Kop3"/>
       </w:pPr>
-      <w:bookmarkStart w:id="16" w:name="_Toc228883600"/>
+      <w:bookmarkStart w:id="15" w:name="_Toc228883600"/>
       <w:r>
         <w:t>Play playlist</w:t>
       </w:r>
-      <w:bookmarkEnd w:id="16"/>
+      <w:bookmarkEnd w:id="15"/>
     </w:p>
     <w:p>
       <w:pPr>
@@ -2221,13 +2166,7 @@
         <w:ind w:left="993" w:hanging="284"/>
       </w:pPr>
       <w:r>
-        <w:t xml:space="preserve">Continue playing </w:t>
-      </w:r>
-      <w:r>
-        <w:t xml:space="preserve">paused </w:t>
-      </w:r>
-      <w:r>
-        <w:t>song</w:t>
+        <w:t>Continue playing paused song</w:t>
       </w:r>
     </w:p>
     <w:p>
@@ -2249,13 +2188,7 @@
         <w:ind w:left="993" w:hanging="284"/>
       </w:pPr>
       <w:r>
-        <w:t xml:space="preserve">Play first song from shuffled </w:t>
-      </w:r>
-      <w:r>
-        <w:t xml:space="preserve">stopped </w:t>
-      </w:r>
-      <w:r>
-        <w:t>playlist</w:t>
+        <w:t>Play first song from shuffled stopped playlist</w:t>
       </w:r>
     </w:p>
     <w:p>
@@ -2280,13 +2213,7 @@
         <w:ind w:left="993" w:hanging="284"/>
       </w:pPr>
       <w:r>
-        <w:t xml:space="preserve">Play </w:t>
-      </w:r>
-      <w:r>
-        <w:t xml:space="preserve">first song from shuffled </w:t>
-      </w:r>
-      <w:r>
-        <w:t>playlist</w:t>
+        <w:t>Play first song from shuffled playlist</w:t>
       </w:r>
     </w:p>
     <w:p>
@@ -2294,10 +2221,7 @@
         <w:pStyle w:val="Kop4"/>
       </w:pPr>
       <w:r>
-        <w:t xml:space="preserve">If playlist is </w:t>
-      </w:r>
-      <w:r>
-        <w:t>custom</w:t>
+        <w:t>If playlist is custom</w:t>
       </w:r>
     </w:p>
     <w:p>
@@ -2311,40 +2235,25 @@
         <w:ind w:left="993" w:hanging="284"/>
       </w:pPr>
       <w:r>
-        <w:t xml:space="preserve">Play </w:t>
-      </w:r>
-      <w:r>
-        <w:t xml:space="preserve">first song from custom </w:t>
-      </w:r>
-      <w:r>
-        <w:t>playlis</w:t>
-      </w:r>
-      <w:r>
-        <w:t>t</w:t>
+        <w:t>Play first song from custom playlist</w:t>
       </w:r>
     </w:p>
     <w:p>
       <w:pPr>
         <w:pStyle w:val="Kop3"/>
       </w:pPr>
-      <w:bookmarkStart w:id="17" w:name="_Toc228883601"/>
-      <w:r>
-        <w:t xml:space="preserve">Play </w:t>
-      </w:r>
-      <w:r>
-        <w:t>song</w:t>
-      </w:r>
-      <w:bookmarkEnd w:id="17"/>
+      <w:bookmarkStart w:id="16" w:name="_Toc228883601"/>
+      <w:r>
+        <w:t>Play song</w:t>
+      </w:r>
+      <w:bookmarkEnd w:id="16"/>
     </w:p>
     <w:p>
       <w:pPr>
         <w:pStyle w:val="Kop4"/>
       </w:pPr>
       <w:r>
-        <w:t xml:space="preserve">If </w:t>
-      </w:r>
-      <w:r>
-        <w:t>LMPDS is playing</w:t>
+        <w:t>If LMPDS is playing</w:t>
       </w:r>
     </w:p>
     <w:p>
@@ -2394,10 +2303,7 @@
         <w:pStyle w:val="Kop4"/>
       </w:pPr>
       <w:r>
-        <w:t xml:space="preserve">If LMPDS is </w:t>
-      </w:r>
-      <w:r>
-        <w:t>not playing</w:t>
+        <w:t>If LMPDS is not playing</w:t>
       </w:r>
     </w:p>
     <w:p>
@@ -2418,14 +2324,11 @@
       <w:pPr>
         <w:pStyle w:val="Kop3"/>
       </w:pPr>
-      <w:bookmarkStart w:id="18" w:name="_Toc228883602"/>
-      <w:r>
-        <w:t>P</w:t>
-      </w:r>
-      <w:r>
-        <w:t>ause</w:t>
-      </w:r>
-      <w:bookmarkEnd w:id="18"/>
+      <w:bookmarkStart w:id="17" w:name="_Toc228883602"/>
+      <w:r>
+        <w:t>Pause</w:t>
+      </w:r>
+      <w:bookmarkEnd w:id="17"/>
     </w:p>
     <w:p>
       <w:pPr>
@@ -2453,22 +2356,19 @@
       <w:pPr>
         <w:pStyle w:val="Kop3"/>
       </w:pPr>
-      <w:bookmarkStart w:id="19" w:name="_Toc228883603"/>
+      <w:bookmarkStart w:id="18" w:name="_Toc228883603"/>
       <w:r>
         <w:lastRenderedPageBreak/>
         <w:t>Next</w:t>
       </w:r>
-      <w:bookmarkEnd w:id="19"/>
+      <w:bookmarkEnd w:id="18"/>
     </w:p>
     <w:p>
       <w:pPr>
         <w:pStyle w:val="Kop4"/>
       </w:pPr>
       <w:r>
-        <w:t>If LMPDS is playing</w:t>
-      </w:r>
-      <w:r>
-        <w:t xml:space="preserve"> directory</w:t>
+        <w:t>If LMPDS is playing directory</w:t>
       </w:r>
     </w:p>
     <w:p>
@@ -2490,10 +2390,7 @@
         <w:pStyle w:val="Kop4"/>
       </w:pPr>
       <w:r>
-        <w:t xml:space="preserve">If LMPDS is playing </w:t>
-      </w:r>
-      <w:r>
-        <w:t>custom</w:t>
+        <w:t>If LMPDS is playing custom</w:t>
       </w:r>
     </w:p>
     <w:p>
@@ -2509,18 +2406,18 @@
       <w:r>
         <w:t xml:space="preserve">Play </w:t>
       </w:r>
-      <w:commentRangeStart w:id="20"/>
+      <w:commentRangeStart w:id="19"/>
       <w:r>
         <w:t>next</w:t>
       </w:r>
-      <w:commentRangeEnd w:id="20"/>
+      <w:commentRangeEnd w:id="19"/>
       <w:r>
         <w:rPr>
           <w:rStyle w:val="Verwijzingopmerking"/>
           <w:sz w:val="22"/>
           <w:szCs w:val="22"/>
         </w:rPr>
-        <w:commentReference w:id="20"/>
+        <w:commentReference w:id="19"/>
       </w:r>
       <w:r>
         <w:t xml:space="preserve"> song in playlist</w:t>
@@ -2530,11 +2427,11 @@
       <w:pPr>
         <w:pStyle w:val="Kop3"/>
       </w:pPr>
-      <w:bookmarkStart w:id="21" w:name="_Toc228883604"/>
+      <w:bookmarkStart w:id="20" w:name="_Toc228883604"/>
       <w:r>
         <w:t>Stop</w:t>
       </w:r>
-      <w:bookmarkEnd w:id="21"/>
+      <w:bookmarkEnd w:id="20"/>
     </w:p>
     <w:p>
       <w:pPr>
@@ -2555,21 +2452,18 @@
         <w:ind w:left="993" w:hanging="284"/>
       </w:pPr>
       <w:r>
-        <w:t>Stop</w:t>
-      </w:r>
-      <w:r>
-        <w:t xml:space="preserve"> playing playlist song</w:t>
+        <w:t>Stop playing playlist song</w:t>
       </w:r>
     </w:p>
     <w:p>
       <w:pPr>
         <w:pStyle w:val="Kop3"/>
       </w:pPr>
-      <w:bookmarkStart w:id="22" w:name="_Toc228883605"/>
+      <w:bookmarkStart w:id="21" w:name="_Toc228883605"/>
       <w:r>
         <w:t>Add custom playlist</w:t>
       </w:r>
-      <w:bookmarkEnd w:id="22"/>
+      <w:bookmarkEnd w:id="21"/>
     </w:p>
     <w:p>
       <w:pPr>
@@ -2589,14 +2483,11 @@
       <w:pPr>
         <w:pStyle w:val="Kop3"/>
       </w:pPr>
-      <w:bookmarkStart w:id="23" w:name="_Toc228883606"/>
-      <w:r>
-        <w:t>Add</w:t>
-      </w:r>
-      <w:r>
-        <w:t xml:space="preserve"> song to custom playlist</w:t>
-      </w:r>
-      <w:bookmarkEnd w:id="23"/>
+      <w:bookmarkStart w:id="22" w:name="_Toc228883606"/>
+      <w:r>
+        <w:t>Add song to custom playlist</w:t>
+      </w:r>
+      <w:bookmarkEnd w:id="22"/>
     </w:p>
     <w:p>
       <w:pPr>
@@ -2609,33 +2500,18 @@
         <w:ind w:left="709" w:hanging="284"/>
       </w:pPr>
       <w:r>
-        <w:t xml:space="preserve">Add </w:t>
-      </w:r>
-      <w:r>
-        <w:t>song to existing c</w:t>
-      </w:r>
-      <w:r>
-        <w:t>ustom playlist</w:t>
+        <w:t>Add song to existing custom playlist</w:t>
       </w:r>
     </w:p>
     <w:p>
       <w:pPr>
         <w:pStyle w:val="Kop3"/>
       </w:pPr>
-      <w:bookmarkStart w:id="24" w:name="_Toc228883607"/>
-      <w:r>
-        <w:t xml:space="preserve">Remove </w:t>
-      </w:r>
-      <w:r>
-        <w:t xml:space="preserve">song </w:t>
-      </w:r>
-      <w:r>
-        <w:t>from</w:t>
-      </w:r>
-      <w:r>
-        <w:t xml:space="preserve"> custom playlist</w:t>
-      </w:r>
-      <w:bookmarkEnd w:id="24"/>
+      <w:bookmarkStart w:id="23" w:name="_Toc228883607"/>
+      <w:r>
+        <w:t>Remove song from custom playlist</w:t>
+      </w:r>
+      <w:bookmarkEnd w:id="23"/>
     </w:p>
     <w:p>
       <w:pPr>
@@ -2648,27 +2524,18 @@
         <w:ind w:left="709" w:hanging="284"/>
       </w:pPr>
       <w:r>
-        <w:t xml:space="preserve">Remove </w:t>
-      </w:r>
-      <w:r>
-        <w:t xml:space="preserve">song </w:t>
-      </w:r>
-      <w:r>
-        <w:t xml:space="preserve">from </w:t>
-      </w:r>
-      <w:r>
-        <w:t>existing custom playlist</w:t>
+        <w:t>Remove song from existing custom playlist</w:t>
       </w:r>
     </w:p>
     <w:p>
       <w:pPr>
         <w:pStyle w:val="Kop3"/>
       </w:pPr>
-      <w:bookmarkStart w:id="25" w:name="_Toc228883608"/>
+      <w:bookmarkStart w:id="24" w:name="_Toc228883608"/>
       <w:r>
         <w:t>Remove custom playlist</w:t>
       </w:r>
-      <w:bookmarkEnd w:id="25"/>
+      <w:bookmarkEnd w:id="24"/>
     </w:p>
     <w:p>
       <w:pPr>
@@ -2688,11 +2555,11 @@
       <w:pPr>
         <w:pStyle w:val="Kop3"/>
       </w:pPr>
-      <w:bookmarkStart w:id="26" w:name="_Toc228883609"/>
+      <w:bookmarkStart w:id="25" w:name="_Toc228883609"/>
       <w:r>
         <w:t>Preset or playlist is webradio</w:t>
       </w:r>
-      <w:bookmarkEnd w:id="26"/>
+      <w:bookmarkEnd w:id="25"/>
     </w:p>
     <w:p>
       <w:pPr>
@@ -2705,21 +2572,18 @@
         <w:ind w:left="709" w:hanging="284"/>
       </w:pPr>
       <w:r>
-        <w:t>R</w:t>
-      </w:r>
-      <w:r>
-        <w:t>eturn True if the (preset) playlist is a webradio</w:t>
+        <w:t>Return True if the (preset) playlist is a webradio</w:t>
       </w:r>
     </w:p>
     <w:p>
       <w:pPr>
         <w:pStyle w:val="Kop3"/>
       </w:pPr>
-      <w:bookmarkStart w:id="27" w:name="_Toc228883610"/>
+      <w:bookmarkStart w:id="26" w:name="_Toc228883610"/>
       <w:r>
         <w:t>Get directories</w:t>
       </w:r>
-      <w:bookmarkEnd w:id="27"/>
+      <w:bookmarkEnd w:id="26"/>
     </w:p>
     <w:p>
       <w:pPr>
@@ -2734,32 +2598,29 @@
       <w:r>
         <w:t xml:space="preserve">Return list of music </w:t>
       </w:r>
-      <w:commentRangeStart w:id="28"/>
+      <w:commentRangeStart w:id="27"/>
       <w:r>
         <w:t>directories</w:t>
       </w:r>
-      <w:commentRangeEnd w:id="28"/>
+      <w:commentRangeEnd w:id="27"/>
       <w:r>
         <w:rPr>
           <w:rStyle w:val="Verwijzingopmerking"/>
           <w:sz w:val="22"/>
           <w:szCs w:val="22"/>
         </w:rPr>
-        <w:commentReference w:id="28"/>
+        <w:commentReference w:id="27"/>
       </w:r>
     </w:p>
     <w:p>
       <w:pPr>
         <w:pStyle w:val="Kop3"/>
       </w:pPr>
-      <w:bookmarkStart w:id="29" w:name="_Toc228883611"/>
-      <w:r>
-        <w:t xml:space="preserve">Get </w:t>
-      </w:r>
-      <w:r>
-        <w:t>custom playlists</w:t>
-      </w:r>
-      <w:bookmarkEnd w:id="29"/>
+      <w:bookmarkStart w:id="28" w:name="_Toc228883611"/>
+      <w:r>
+        <w:t>Get custom playlists</w:t>
+      </w:r>
+      <w:bookmarkEnd w:id="28"/>
     </w:p>
     <w:p>
       <w:pPr>
@@ -2772,50 +2633,38 @@
         <w:ind w:left="709" w:hanging="284"/>
       </w:pPr>
       <w:r>
-        <w:t>Return list of</w:t>
-      </w:r>
-      <w:r>
-        <w:t xml:space="preserve"> </w:t>
-      </w:r>
-      <w:r>
-        <w:t xml:space="preserve"> </w:t>
-      </w:r>
-      <w:commentRangeStart w:id="30"/>
+        <w:t xml:space="preserve">Return list of  </w:t>
+      </w:r>
+      <w:commentRangeStart w:id="29"/>
       <w:r>
         <w:t>custom playlists</w:t>
       </w:r>
-      <w:commentRangeEnd w:id="30"/>
+      <w:commentRangeEnd w:id="29"/>
       <w:r>
         <w:rPr>
           <w:rStyle w:val="Verwijzingopmerking"/>
           <w:sz w:val="22"/>
           <w:szCs w:val="22"/>
         </w:rPr>
-        <w:commentReference w:id="30"/>
+        <w:commentReference w:id="29"/>
       </w:r>
     </w:p>
     <w:p>
       <w:pPr>
         <w:pStyle w:val="Kop3"/>
       </w:pPr>
-      <w:bookmarkStart w:id="31" w:name="_Toc228883612"/>
-      <w:r>
-        <w:t>Get playlist</w:t>
-      </w:r>
-      <w:r>
-        <w:t xml:space="preserve"> songs</w:t>
-      </w:r>
-      <w:bookmarkEnd w:id="31"/>
+      <w:bookmarkStart w:id="30" w:name="_Toc228883612"/>
+      <w:r>
+        <w:t>Get playlist songs</w:t>
+      </w:r>
+      <w:bookmarkEnd w:id="30"/>
     </w:p>
     <w:p>
       <w:pPr>
         <w:pStyle w:val="Kop4"/>
       </w:pPr>
       <w:r>
-        <w:t xml:space="preserve">If </w:t>
-      </w:r>
-      <w:r>
-        <w:t>playlist is not a webradio</w:t>
+        <w:t>If playlist is not a webradio</w:t>
       </w:r>
     </w:p>
     <w:p>
@@ -2829,37 +2678,31 @@
         <w:ind w:left="993" w:hanging="284"/>
       </w:pPr>
       <w:r>
-        <w:t>Return list of</w:t>
-      </w:r>
-      <w:r>
-        <w:t xml:space="preserve"> </w:t>
-      </w:r>
-      <w:commentRangeStart w:id="32"/>
-      <w:r>
-        <w:t>playlist</w:t>
-      </w:r>
-      <w:r>
-        <w:t xml:space="preserve"> songs</w:t>
-      </w:r>
-      <w:commentRangeEnd w:id="32"/>
+        <w:t xml:space="preserve">Return list of </w:t>
+      </w:r>
+      <w:commentRangeStart w:id="31"/>
+      <w:r>
+        <w:t>playlist songs</w:t>
+      </w:r>
+      <w:commentRangeEnd w:id="31"/>
       <w:r>
         <w:rPr>
           <w:rStyle w:val="Verwijzingopmerking"/>
           <w:sz w:val="22"/>
           <w:szCs w:val="22"/>
         </w:rPr>
-        <w:commentReference w:id="32"/>
+        <w:commentReference w:id="31"/>
       </w:r>
     </w:p>
     <w:p>
       <w:pPr>
         <w:pStyle w:val="Kop3"/>
       </w:pPr>
-      <w:bookmarkStart w:id="33" w:name="_Toc228883613"/>
+      <w:bookmarkStart w:id="32" w:name="_Toc228883613"/>
       <w:r>
         <w:t>Search</w:t>
       </w:r>
-      <w:bookmarkEnd w:id="33"/>
+      <w:bookmarkEnd w:id="32"/>
     </w:p>
     <w:p>
       <w:pPr>
@@ -2874,25 +2717,356 @@
       <w:r>
         <w:t xml:space="preserve">Return </w:t>
       </w:r>
-      <w:commentRangeStart w:id="34"/>
-      <w:r>
-        <w:t>list of s</w:t>
-      </w:r>
-      <w:r>
-        <w:t>ongs</w:t>
-      </w:r>
-      <w:commentRangeEnd w:id="34"/>
+      <w:commentRangeStart w:id="33"/>
+      <w:r>
+        <w:t>list of songs</w:t>
+      </w:r>
+      <w:commentRangeEnd w:id="33"/>
       <w:r>
         <w:rPr>
           <w:rStyle w:val="Verwijzingopmerking"/>
           <w:sz w:val="22"/>
           <w:szCs w:val="22"/>
         </w:rPr>
-        <w:commentReference w:id="34"/>
+        <w:commentReference w:id="33"/>
       </w:r>
       <w:r>
         <w:t xml:space="preserve"> matching search pattern in song artist or title</w:t>
       </w:r>
+    </w:p>
+    <w:p>
+      <w:pPr>
+        <w:pStyle w:val="Kop2"/>
+        <w:rPr>
+          <w:szCs w:val="36"/>
+        </w:rPr>
+      </w:pPr>
+      <w:r>
+        <w:rPr>
+          <w:szCs w:val="36"/>
+        </w:rPr>
+        <w:t xml:space="preserve">MPD </w:t>
+      </w:r>
+      <w:r>
+        <w:rPr>
+          <w:szCs w:val="36"/>
+        </w:rPr>
+        <w:t>monitor</w:t>
+      </w:r>
+    </w:p>
+    <w:p>
+      <w:pPr>
+        <w:pStyle w:val="Kop3"/>
+      </w:pPr>
+      <w:r>
+        <w:t>Initialize</w:t>
+      </w:r>
+    </w:p>
+    <w:p>
+      <w:pPr>
+        <w:pStyle w:val="Lijstalinea"/>
+        <w:numPr>
+          <w:ilvl w:val="0"/>
+          <w:numId w:val="15"/>
+        </w:numPr>
+        <w:suppressAutoHyphens/>
+        <w:ind w:left="709" w:hanging="284"/>
+      </w:pPr>
+      <w:r>
+        <w:t>Connect to LMPDS using MPD service</w:t>
+      </w:r>
+    </w:p>
+    <w:p>
+      <w:pPr>
+        <w:pStyle w:val="Lijstalinea"/>
+        <w:numPr>
+          <w:ilvl w:val="0"/>
+          <w:numId w:val="15"/>
+        </w:numPr>
+        <w:suppressAutoHyphens/>
+        <w:ind w:left="709" w:hanging="284"/>
+      </w:pPr>
+      <w:r>
+        <w:t>Create database snapshot</w:t>
+      </w:r>
+    </w:p>
+    <w:p>
+      <w:pPr>
+        <w:pStyle w:val="Lijstalinea"/>
+        <w:numPr>
+          <w:ilvl w:val="0"/>
+          <w:numId w:val="15"/>
+        </w:numPr>
+        <w:suppressAutoHyphens/>
+        <w:ind w:left="709" w:hanging="284"/>
+      </w:pPr>
+      <w:r>
+        <w:t>Start LMPDS event monitor</w:t>
+      </w:r>
+    </w:p>
+    <w:p>
+      <w:pPr>
+        <w:pStyle w:val="Kop3"/>
+      </w:pPr>
+      <w:r>
+        <w:lastRenderedPageBreak/>
+        <w:t>Event: database changed</w:t>
+      </w:r>
+    </w:p>
+    <w:p>
+      <w:pPr>
+        <w:pStyle w:val="Lijstalinea"/>
+        <w:numPr>
+          <w:ilvl w:val="0"/>
+          <w:numId w:val="15"/>
+        </w:numPr>
+        <w:suppressAutoHyphens/>
+        <w:ind w:left="709" w:hanging="284"/>
+      </w:pPr>
+      <w:r>
+        <w:t>Log</w:t>
+      </w:r>
+      <w:r>
+        <w:t xml:space="preserve"> </w:t>
+      </w:r>
+      <w:r>
+        <w:t>added/removed files to music database</w:t>
+      </w:r>
+    </w:p>
+    <w:p>
+      <w:pPr>
+        <w:pStyle w:val="Lijstalinea"/>
+        <w:numPr>
+          <w:ilvl w:val="0"/>
+          <w:numId w:val="15"/>
+        </w:numPr>
+        <w:suppressAutoHyphens/>
+        <w:ind w:left="709" w:hanging="284"/>
+      </w:pPr>
+      <w:r>
+        <w:t>Update database snapshot</w:t>
+      </w:r>
+    </w:p>
+    <w:p>
+      <w:pPr>
+        <w:pStyle w:val="Kop3"/>
+      </w:pPr>
+      <w:r>
+        <w:t>Event</w:t>
+      </w:r>
+      <w:r>
+        <w:t>s</w:t>
+      </w:r>
+      <w:r>
+        <w:t>:</w:t>
+      </w:r>
+      <w:r>
+        <w:br/>
+      </w:r>
+      <w:r>
+        <w:rPr>
+          <w:color w:val="auto"/>
+          <w:sz w:val="24"/>
+          <w:szCs w:val="22"/>
+        </w:rPr>
+        <w:t>- Current playlist changed</w:t>
+      </w:r>
+      <w:r>
+        <w:rPr>
+          <w:color w:val="auto"/>
+          <w:sz w:val="24"/>
+          <w:szCs w:val="22"/>
+        </w:rPr>
+        <w:br/>
+        <w:t>- Playback state changed</w:t>
+      </w:r>
+    </w:p>
+    <w:p>
+      <w:pPr>
+        <w:pStyle w:val="Lijstalinea"/>
+        <w:numPr>
+          <w:ilvl w:val="0"/>
+          <w:numId w:val="15"/>
+        </w:numPr>
+        <w:suppressAutoHyphens/>
+        <w:ind w:left="709" w:hanging="284"/>
+      </w:pPr>
+      <w:r>
+        <w:t>Log new current song artist &amp; title</w:t>
+      </w:r>
+    </w:p>
+    <w:p>
+      <w:pPr>
+        <w:pStyle w:val="Kop3"/>
+        <w:rPr>
+          <w:color w:val="auto"/>
+          <w:sz w:val="24"/>
+          <w:szCs w:val="22"/>
+        </w:rPr>
+      </w:pPr>
+      <w:r>
+        <w:t>Event</w:t>
+      </w:r>
+      <w:r>
+        <w:t>s</w:t>
+      </w:r>
+      <w:r>
+        <w:t>:</w:t>
+      </w:r>
+      <w:r>
+        <w:br/>
+      </w:r>
+      <w:r>
+        <w:rPr>
+          <w:color w:val="auto"/>
+          <w:sz w:val="24"/>
+          <w:szCs w:val="22"/>
+        </w:rPr>
+        <w:t xml:space="preserve">- </w:t>
+      </w:r>
+      <w:r>
+        <w:rPr>
+          <w:color w:val="auto"/>
+          <w:sz w:val="24"/>
+          <w:szCs w:val="22"/>
+        </w:rPr>
+        <w:t>D</w:t>
+      </w:r>
+      <w:r>
+        <w:rPr>
+          <w:color w:val="auto"/>
+          <w:sz w:val="24"/>
+          <w:szCs w:val="22"/>
+        </w:rPr>
+        <w:t>atabase update in progress or finished</w:t>
+      </w:r>
+      <w:r>
+        <w:rPr>
+          <w:color w:val="auto"/>
+          <w:sz w:val="24"/>
+          <w:szCs w:val="22"/>
+        </w:rPr>
+        <w:br/>
+        <w:t xml:space="preserve">- </w:t>
+      </w:r>
+      <w:r>
+        <w:rPr>
+          <w:color w:val="auto"/>
+          <w:sz w:val="24"/>
+          <w:szCs w:val="22"/>
+        </w:rPr>
+        <w:t>Stored playlist changed</w:t>
+      </w:r>
+      <w:r>
+        <w:rPr>
+          <w:color w:val="auto"/>
+          <w:sz w:val="24"/>
+          <w:szCs w:val="22"/>
+        </w:rPr>
+        <w:br/>
+      </w:r>
+      <w:r>
+        <w:rPr>
+          <w:color w:val="auto"/>
+          <w:sz w:val="24"/>
+          <w:szCs w:val="22"/>
+        </w:rPr>
+        <w:t>- Volume/crossfade changed</w:t>
+      </w:r>
+      <w:r>
+        <w:rPr>
+          <w:color w:val="auto"/>
+          <w:sz w:val="24"/>
+          <w:szCs w:val="22"/>
+        </w:rPr>
+        <w:br/>
+      </w:r>
+      <w:r>
+        <w:rPr>
+          <w:color w:val="auto"/>
+          <w:sz w:val="24"/>
+          <w:szCs w:val="22"/>
+        </w:rPr>
+        <w:t>- Output devices changed</w:t>
+      </w:r>
+      <w:r>
+        <w:rPr>
+          <w:color w:val="auto"/>
+          <w:sz w:val="24"/>
+          <w:szCs w:val="22"/>
+        </w:rPr>
+        <w:br/>
+      </w:r>
+      <w:r>
+        <w:rPr>
+          <w:color w:val="auto"/>
+          <w:sz w:val="24"/>
+          <w:szCs w:val="22"/>
+        </w:rPr>
+        <w:t>- Global options changed</w:t>
+      </w:r>
+      <w:r>
+        <w:rPr>
+          <w:color w:val="auto"/>
+          <w:sz w:val="24"/>
+          <w:szCs w:val="22"/>
+        </w:rPr>
+        <w:br/>
+        <w:t>- Song sticker changed</w:t>
+      </w:r>
+      <w:r>
+        <w:rPr>
+          <w:color w:val="auto"/>
+          <w:sz w:val="24"/>
+          <w:szCs w:val="22"/>
+        </w:rPr>
+        <w:br/>
+        <w:t xml:space="preserve">- </w:t>
+      </w:r>
+      <w:r>
+        <w:rPr>
+          <w:color w:val="auto"/>
+          <w:sz w:val="24"/>
+          <w:szCs w:val="22"/>
+        </w:rPr>
+        <w:t>Subscription state changed</w:t>
+      </w:r>
+      <w:r>
+        <w:rPr>
+          <w:color w:val="auto"/>
+          <w:sz w:val="24"/>
+          <w:szCs w:val="22"/>
+        </w:rPr>
+        <w:br/>
+        <w:t xml:space="preserve">- </w:t>
+      </w:r>
+      <w:r>
+        <w:rPr>
+          <w:color w:val="auto"/>
+          <w:sz w:val="24"/>
+          <w:szCs w:val="22"/>
+        </w:rPr>
+        <w:t>Message sent via MPD</w:t>
+      </w:r>
+    </w:p>
+    <w:p>
+      <w:pPr>
+        <w:pStyle w:val="Lijstalinea"/>
+        <w:numPr>
+          <w:ilvl w:val="0"/>
+          <w:numId w:val="15"/>
+        </w:numPr>
+        <w:suppressAutoHyphens/>
+        <w:ind w:left="709" w:hanging="284"/>
+      </w:pPr>
+      <w:r>
+        <w:t>Log event details</w:t>
+      </w:r>
+    </w:p>
+    <w:p>
+      <w:pPr>
+        <w:suppressAutoHyphens/>
+      </w:pPr>
     </w:p>
     <w:p/>
     <w:sectPr>
@@ -2972,7 +3146,7 @@
       </w:r>
     </w:p>
   </w:comment>
-  <w:comment w:id="10" w:author="Onno Janssen" w:date="2026-05-05T13:28:00Z" w:initials="OJ">
+  <w:comment w:id="12" w:author="Onno Janssen" w:date="2026-05-05T13:44:00Z" w:initials="OJ">
     <w:p>
       <w:pPr>
         <w:pStyle w:val="Tekstopmerking"/>
@@ -2984,11 +3158,11 @@
         <w:annotationRef/>
       </w:r>
       <w:r>
-        <w:t>Zorgt voor de verbinding met LMPDS en geeft een wrapper naar LMPDS. Fouten worden gelogd en wrapper geeft False terug. De aanroepende functie weet dus alleen dat de call mislukt is, niet wat er mislukt is.</w:t>
+        <w:t>Er is geen check of USB aanwezig is, of presets geladen zijn, of directories beschikbaar zijn</w:t>
       </w:r>
     </w:p>
   </w:comment>
-  <w:comment w:id="13" w:author="Onno Janssen" w:date="2026-05-05T13:44:00Z" w:initials="OJ">
+  <w:comment w:id="13" w:author="Onno Janssen" w:date="2026-05-05T13:46:00Z" w:initials="OJ">
     <w:p>
       <w:pPr>
         <w:pStyle w:val="Tekstopmerking"/>
@@ -3000,11 +3174,11 @@
         <w:annotationRef/>
       </w:r>
       <w:r>
-        <w:t>Er is geen check of USB aanwezig is, of presets geladen zijn, of directories beschikbaar zijn</w:t>
+        <w:t>Er is geen check/update van de custom playlists, of de songs nog overeenkomen met de songs in de directories</w:t>
       </w:r>
     </w:p>
   </w:comment>
-  <w:comment w:id="14" w:author="Onno Janssen" w:date="2026-05-05T13:46:00Z" w:initials="OJ">
+  <w:comment w:id="19" w:author="Onno Janssen" w:date="2026-05-05T14:09:00Z" w:initials="OJ">
     <w:p>
       <w:pPr>
         <w:pStyle w:val="Tekstopmerking"/>
@@ -3016,11 +3190,11 @@
         <w:annotationRef/>
       </w:r>
       <w:r>
-        <w:t>Er is geen check/update van de custom playlists, of de songs nog overeenkomen met de songs in de directories</w:t>
+        <w:t>Bij laatste song is next de eerste song</w:t>
       </w:r>
     </w:p>
   </w:comment>
-  <w:comment w:id="20" w:author="Onno Janssen" w:date="2026-05-05T14:09:00Z" w:initials="OJ">
+  <w:comment w:id="27" w:author="Onno Janssen" w:date="2026-05-05T14:20:00Z" w:initials="OJ">
     <w:p>
       <w:pPr>
         <w:pStyle w:val="Tekstopmerking"/>
@@ -3032,11 +3206,11 @@
         <w:annotationRef/>
       </w:r>
       <w:r>
-        <w:t>Bij laatste song is next de eerste song</w:t>
+        <w:t>Er is geen check of de USB aanwezig is, of de folder bestaat</w:t>
       </w:r>
     </w:p>
   </w:comment>
-  <w:comment w:id="28" w:author="Onno Janssen" w:date="2026-05-05T14:20:00Z" w:initials="OJ">
+  <w:comment w:id="29" w:author="Onno Janssen" w:date="2026-05-05T14:20:00Z" w:initials="OJ">
     <w:p>
       <w:pPr>
         <w:pStyle w:val="Tekstopmerking"/>
@@ -3052,7 +3226,7 @@
       </w:r>
     </w:p>
   </w:comment>
-  <w:comment w:id="30" w:author="Onno Janssen" w:date="2026-05-05T14:20:00Z" w:initials="OJ">
+  <w:comment w:id="31" w:author="Onno Janssen" w:date="2026-05-05T14:20:00Z" w:initials="OJ">
     <w:p>
       <w:pPr>
         <w:pStyle w:val="Tekstopmerking"/>
@@ -3068,23 +3242,7 @@
       </w:r>
     </w:p>
   </w:comment>
-  <w:comment w:id="32" w:author="Onno Janssen" w:date="2026-05-05T14:20:00Z" w:initials="OJ">
-    <w:p>
-      <w:pPr>
-        <w:pStyle w:val="Tekstopmerking"/>
-      </w:pPr>
-      <w:r>
-        <w:rPr>
-          <w:rStyle w:val="Verwijzingopmerking"/>
-        </w:rPr>
-        <w:annotationRef/>
-      </w:r>
-      <w:r>
-        <w:t>Er is geen check of de USB aanwezig is, of de folder bestaat</w:t>
-      </w:r>
-    </w:p>
-  </w:comment>
-  <w:comment w:id="34" w:author="Onno Janssen" w:date="2026-05-05T14:20:00Z" w:initials="OJ">
+  <w:comment w:id="33" w:author="Onno Janssen" w:date="2026-05-05T14:20:00Z" w:initials="OJ">
     <w:p>
       <w:pPr>
         <w:pStyle w:val="Tekstopmerking"/>
@@ -3109,7 +3267,6 @@
   <w15:commentEx w15:paraId="15036EAF" w15:done="0"/>
   <w15:commentEx w15:paraId="7854177B" w15:done="0"/>
   <w15:commentEx w15:paraId="58F631F5" w15:done="0"/>
-  <w15:commentEx w15:paraId="6622AB5B" w15:done="0"/>
   <w15:commentEx w15:paraId="641E6895" w15:done="0"/>
   <w15:commentEx w15:paraId="58DDA949" w15:done="0"/>
   <w15:commentEx w15:paraId="57E862B5" w15:done="0"/>
@@ -3126,7 +3283,6 @@
   <w16cex:commentExtensible w16cex:durableId="1DABD8C9" w16cex:dateUtc="2026-05-05T11:15:00Z"/>
   <w16cex:commentExtensible w16cex:durableId="17A7C7B2" w16cex:dateUtc="2026-05-05T11:28:00Z"/>
   <w16cex:commentExtensible w16cex:durableId="53982789" w16cex:dateUtc="2026-05-05T11:34:00Z"/>
-  <w16cex:commentExtensible w16cex:durableId="771EF1F8" w16cex:dateUtc="2026-05-05T11:28:00Z"/>
   <w16cex:commentExtensible w16cex:durableId="78B9E554" w16cex:dateUtc="2026-05-05T11:44:00Z"/>
   <w16cex:commentExtensible w16cex:durableId="1BAAC897" w16cex:dateUtc="2026-05-05T11:46:00Z"/>
   <w16cex:commentExtensible w16cex:durableId="486528E0" w16cex:dateUtc="2026-05-05T12:09:00Z"/>
@@ -3143,7 +3299,6 @@
   <w16cid:commentId w16cid:paraId="15036EAF" w16cid:durableId="1DABD8C9"/>
   <w16cid:commentId w16cid:paraId="7854177B" w16cid:durableId="17A7C7B2"/>
   <w16cid:commentId w16cid:paraId="58F631F5" w16cid:durableId="53982789"/>
-  <w16cid:commentId w16cid:paraId="6622AB5B" w16cid:durableId="771EF1F8"/>
   <w16cid:commentId w16cid:paraId="641E6895" w16cid:durableId="78B9E554"/>
   <w16cid:commentId w16cid:paraId="58DDA949" w16cid:durableId="1BAAC897"/>
   <w16cid:commentId w16cid:paraId="57E862B5" w16cid:durableId="486528E0"/>

</xml_diff>